<commit_message>
Add GitHub repository link to project memo
</commit_message>
<xml_diff>
--- a/docs/MING_Vibe_Coding_Project_Memo.docx
+++ b/docs/MING_Vibe_Coding_Project_Memo.docx
@@ -134,7 +134,7 @@
     </w:p>
     <w:p>
       <w:pPr>
-        <w:spacing w:after="240"/>
+        <w:spacing w:after="40"/>
       </w:pPr>
       <w:r>
         <w:rPr>
@@ -154,6 +154,31 @@
             <w:u w:val="single"/>
           </w:rPr>
           <w:t>https://temporary-instant-chestnut-6aq70wf.vercel.app/</w:t>
+        </w:r>
+      </w:hyperlink>
+    </w:p>
+    <w:p>
+      <w:pPr>
+        <w:spacing w:after="240"/>
+      </w:pPr>
+      <w:r>
+        <w:rPr>
+          <w:rFonts w:ascii="Arial" w:hAnsi="Arial"/>
+          <w:b/>
+          <w:i w:val="0"/>
+          <w:color w:val="17161A"/>
+          <w:sz w:val="20"/>
+        </w:rPr>
+        <w:t xml:space="preserve">GitHub Repository: </w:t>
+      </w:r>
+      <w:hyperlink r:id="rId12">
+        <w:r>
+          <w:rPr>
+            <w:rFonts w:ascii="Arial" w:hAnsi="Arial"/>
+            <w:color w:val="302A66"/>
+            <w:u w:val="single"/>
+          </w:rPr>
+          <w:t>https://github.com/zhihaofeng123-code/ming-daily-ritual</w:t>
         </w:r>
       </w:hyperlink>
     </w:p>
@@ -838,7 +863,7 @@
                     <pic:cNvPicPr/>
                   </pic:nvPicPr>
                   <pic:blipFill>
-                    <a:blip r:embed="rId12"/>
+                    <a:blip r:embed="rId13"/>
                     <a:stretch>
                       <a:fillRect/>
                     </a:stretch>
@@ -882,7 +907,7 @@
                     <pic:cNvPicPr/>
                   </pic:nvPicPr>
                   <pic:blipFill>
-                    <a:blip r:embed="rId13"/>
+                    <a:blip r:embed="rId14"/>
                     <a:stretch>
                       <a:fillRect/>
                     </a:stretch>
@@ -948,7 +973,7 @@
                     <pic:cNvPicPr/>
                   </pic:nvPicPr>
                   <pic:blipFill>
-                    <a:blip r:embed="rId14"/>
+                    <a:blip r:embed="rId15"/>
                     <a:stretch>
                       <a:fillRect/>
                     </a:stretch>
@@ -992,7 +1017,7 @@
                     <pic:cNvPicPr/>
                   </pic:nvPicPr>
                   <pic:blipFill>
-                    <a:blip r:embed="rId15"/>
+                    <a:blip r:embed="rId16"/>
                     <a:stretch>
                       <a:fillRect/>
                     </a:stretch>

</xml_diff>

<commit_message>
List all public MING repositories in project memo
</commit_message>
<xml_diff>
--- a/docs/MING_Vibe_Coding_Project_Memo.docx
+++ b/docs/MING_Vibe_Coding_Project_Memo.docx
@@ -159,7 +159,7 @@
     </w:p>
     <w:p>
       <w:pPr>
-        <w:spacing w:after="240"/>
+        <w:spacing w:after="20"/>
       </w:pPr>
       <w:r>
         <w:rPr>
@@ -169,7 +169,23 @@
           <w:color w:val="17161A"/>
           <w:sz w:val="20"/>
         </w:rPr>
-        <w:t xml:space="preserve">GitHub Repository: </w:t>
+        <w:t>GitHub Repositories:</w:t>
+      </w:r>
+    </w:p>
+    <w:p>
+      <w:pPr>
+        <w:spacing w:after="20"/>
+        <w:ind w:left="259"/>
+      </w:pPr>
+      <w:r>
+        <w:rPr>
+          <w:rFonts w:ascii="Arial" w:hAnsi="Arial"/>
+          <w:b/>
+          <w:i w:val="0"/>
+          <w:color w:val="17161A"/>
+          <w:sz w:val="18"/>
+        </w:rPr>
+        <w:t xml:space="preserve">ming: </w:t>
       </w:r>
       <w:hyperlink r:id="rId12">
         <w:r>
@@ -178,7 +194,59 @@
             <w:color w:val="302A66"/>
             <w:u w:val="single"/>
           </w:rPr>
+          <w:t>https://github.com/zhihaofeng123-code/ming</w:t>
+        </w:r>
+      </w:hyperlink>
+    </w:p>
+    <w:p>
+      <w:pPr>
+        <w:spacing w:after="20"/>
+        <w:ind w:left="259"/>
+      </w:pPr>
+      <w:r>
+        <w:rPr>
+          <w:rFonts w:ascii="Arial" w:hAnsi="Arial"/>
+          <w:b/>
+          <w:i w:val="0"/>
+          <w:color w:val="17161A"/>
+          <w:sz w:val="18"/>
+        </w:rPr>
+        <w:t xml:space="preserve">ming-daily-ritual: </w:t>
+      </w:r>
+      <w:hyperlink r:id="rId13">
+        <w:r>
+          <w:rPr>
+            <w:rFonts w:ascii="Arial" w:hAnsi="Arial"/>
+            <w:color w:val="302A66"/>
+            <w:u w:val="single"/>
+          </w:rPr>
           <w:t>https://github.com/zhihaofeng123-code/ming-daily-ritual</w:t>
+        </w:r>
+      </w:hyperlink>
+    </w:p>
+    <w:p>
+      <w:pPr>
+        <w:spacing w:after="160"/>
+        <w:ind w:left="259"/>
+      </w:pPr>
+      <w:r>
+        <w:rPr>
+          <w:rFonts w:ascii="Arial" w:hAnsi="Arial"/>
+          <w:b/>
+          <w:i w:val="0"/>
+          <w:color w:val="17161A"/>
+          <w:sz w:val="18"/>
+        </w:rPr>
+        <w:t xml:space="preserve">ming-workspace: </w:t>
+      </w:r>
+      <w:hyperlink r:id="rId14">
+        <w:r>
+          <w:rPr>
+            <w:rFonts w:ascii="Arial" w:hAnsi="Arial"/>
+            <w:color w:val="302A66"/>
+            <w:u w:val="single"/>
+          </w:rPr>
+          <w:t>https://github.com/zhihaofeng123-code/ming-workspace</w:t>
         </w:r>
       </w:hyperlink>
     </w:p>
@@ -863,7 +931,7 @@
                     <pic:cNvPicPr/>
                   </pic:nvPicPr>
                   <pic:blipFill>
-                    <a:blip r:embed="rId13"/>
+                    <a:blip r:embed="rId15"/>
                     <a:stretch>
                       <a:fillRect/>
                     </a:stretch>
@@ -907,7 +975,7 @@
                     <pic:cNvPicPr/>
                   </pic:nvPicPr>
                   <pic:blipFill>
-                    <a:blip r:embed="rId14"/>
+                    <a:blip r:embed="rId16"/>
                     <a:stretch>
                       <a:fillRect/>
                     </a:stretch>
@@ -973,7 +1041,7 @@
                     <pic:cNvPicPr/>
                   </pic:nvPicPr>
                   <pic:blipFill>
-                    <a:blip r:embed="rId15"/>
+                    <a:blip r:embed="rId17"/>
                     <a:stretch>
                       <a:fillRect/>
                     </a:stretch>
@@ -1017,7 +1085,7 @@
                     <pic:cNvPicPr/>
                   </pic:nvPicPr>
                   <pic:blipFill>
-                    <a:blip r:embed="rId16"/>
+                    <a:blip r:embed="rId18"/>
                     <a:stretch>
                       <a:fillRect/>
                     </a:stretch>

</xml_diff>

<commit_message>
Expand project memo with full process and supporting work
</commit_message>
<xml_diff>
--- a/docs/MING_Vibe_Coding_Project_Memo.docx
+++ b/docs/MING_Vibe_Coding_Project_Memo.docx
@@ -278,7 +278,7 @@
           <w:color w:val="17161A"/>
           <w:sz w:val="20"/>
         </w:rPr>
-        <w:t>MING is an English-language web experience that introduces Four Pillars (BaZi), a traditional Chinese calendar system, to a global audience. Instead of presenting astrology as a fixed prediction, MING frames it as a personal almanac: a way to understand one’s underlying pattern and read the conditions of a particular day.</w:t>
+        <w:t>MING is an English-language, product-first web experience that introduces Four Pillars (BaZi), a traditional Chinese calendar system, to a global audience. A user can enter birth information immediately and receive a real chart plus Today’s Signal. Instead of presenting astrology as a fixed prediction, MING frames it as a personal almanac: a way to understand one’s underlying pattern and read the conditions of a particular day.</w:t>
       </w:r>
     </w:p>
     <w:p>
@@ -301,7 +301,7 @@
           <w:color w:val="17161A"/>
           <w:sz w:val="20"/>
         </w:rPr>
-        <w:t>The primary audience is English-speaking, globally minded adults who already use modern astrology, self-reflection, or wellness products such as CHANI or Co–Star, but may know little about Chinese metaphysical systems. The product is designed for curious users who want culturally distinctive guidance without needing to read Chinese or learn technical BaZi terminology first.</w:t>
+        <w:t>The primary audience is English-speaking, globally minded adults, roughly ages 22–38, who already use modern astrology, journaling, or self-reflection products such as Co–Star, The Pattern, CHANI, or Human Design, but may know little about Chinese metaphysical systems. A secondary audience is Chinese diaspora users who have heard of BaZi through family but have never received a relevant, accessible explanation. Both groups want culturally distinctive guidance without needing to read Chinese or learn technical terminology first.</w:t>
       </w:r>
     </w:p>
     <w:p>
@@ -324,7 +324,7 @@
           <w:color w:val="17161A"/>
           <w:sz w:val="20"/>
         </w:rPr>
-        <w:t>Most English-language BaZi tools feel like calculators: they produce dense charts, unexplained Chinese characters, or deterministic fortune-telling claims. MING solves the translation and experience problem. It preserves the actual Four Pillars mechanism while turning the result into clear English, transparent reasoning, and a short daily ritual.</w:t>
+        <w:t>Most English-language BaZi tools feel like calculators: they produce dense charts, unexplained Chinese characters, or deterministic fortune-telling claims. Meanwhile, popular astrology apps make self-reflection approachable but often hide the mechanism behind a reading. MING solves both the translation and trust problems. It preserves the actual Four Pillars mechanism while turning the result into clear English, visible reasoning, and a useful two-minute daily ritual.</w:t>
       </w:r>
     </w:p>
     <w:p>
@@ -366,7 +366,24 @@
           <w:color w:val="17161A"/>
           <w:sz w:val="20"/>
         </w:rPr>
-        <w:t>Converts the recorded time to local solar time and calculates the year, month, day, and hour pillars.</w:t>
+        <w:t>Finds the birthplace, applies its time zone and longitude, and converts the recorded time to local solar time.</w:t>
+      </w:r>
+    </w:p>
+    <w:p>
+      <w:pPr>
+        <w:pStyle w:val="ListBullet"/>
+        <w:spacing w:after="60" w:line="252" w:lineRule="auto"/>
+        <w:ind w:left="720" w:hanging="360"/>
+      </w:pPr>
+      <w:r>
+        <w:rPr>
+          <w:rFonts w:ascii="Arial" w:hAnsi="Arial"/>
+          <w:b w:val="0"/>
+          <w:i w:val="0"/>
+          <w:color w:val="17161A"/>
+          <w:sz w:val="20"/>
+        </w:rPr>
+        <w:t>Calculates the year, month, day, and hour pillars using solar-term boundaries rather than January 1.</w:t>
       </w:r>
     </w:p>
     <w:p>
@@ -417,6 +434,23 @@
           <w:color w:val="17161A"/>
           <w:sz w:val="20"/>
         </w:rPr>
+        <w:t>Lets the user move between dates, preserve a result in the URL, and expand the calculation details.</w:t>
+      </w:r>
+    </w:p>
+    <w:p>
+      <w:pPr>
+        <w:pStyle w:val="ListBullet"/>
+        <w:spacing w:after="60" w:line="252" w:lineRule="auto"/>
+        <w:ind w:left="720" w:hanging="360"/>
+      </w:pPr>
+      <w:r>
+        <w:rPr>
+          <w:rFonts w:ascii="Arial" w:hAnsi="Arial"/>
+          <w:b w:val="0"/>
+          <w:i w:val="0"/>
+          <w:color w:val="17161A"/>
+          <w:sz w:val="20"/>
+        </w:rPr>
         <w:t>Shows the calculation and reasoning so the output can be checked instead of accepted as a black box.</w:t>
       </w:r>
     </w:p>
@@ -440,12 +474,7 @@
           <w:color w:val="17161A"/>
           <w:sz w:val="20"/>
         </w:rPr>
-        <w:t>The immediate output is a personalized chart and daily reading. The intended outcome is practical self-reflection: the user understands the conditions they are working with, sees one useful action, and keeps agency over the decision. The page also introduces Chinese astrology through English copy, calligraphy, celestial imagery, and the concepts of chart, timing, relationships, and daily practice.</w:t>
-      </w:r>
-    </w:p>
-    <w:p>
-      <w:r>
-        <w:br w:type="page"/>
+        <w:t>The immediate outputs are a personalized natal chart, the selected day’s chart, a plain-English Today’s Signal, and an expandable derivation of the result. The intended outcome is practical self-reflection: the user understands the conditions they are working with, sees one useful action, and keeps agency over the decision. The full page also introduces Chinese astrology through English copy, original calligraphy and celestial imagery, and four product ideas: understanding yourself, timing, relationships, and a two-minute morning practice.</w:t>
       </w:r>
     </w:p>
     <w:p>
@@ -468,7 +497,7 @@
           <w:color w:val="17161A"/>
           <w:sz w:val="20"/>
         </w:rPr>
-        <w:t>I used a conversational, iterative workflow rather than writing a complete technical specification at the beginning. I first described the product experience, then reacted to each visual and functional version. The AI helped inspect existing repositories, combine the strongest parts into one Next.js project, generate visual assets, implement the interface, run tests, and deploy a working preview.</w:t>
+        <w:t>I used a conversational, iterative workflow rather than writing a complete technical specification at the beginning. The project moved from an early landing-page and waitlist concept to a product-first demo after I decided that visitors should experience value immediately. The AI helped inspect three repositories, compare product directions, research the audience and competitors, generate visual assets, implement the interface and calculation engine, run tests, capture screenshots, and deploy a working preview.</w:t>
       </w:r>
     </w:p>
     <w:p>
@@ -611,6 +640,32 @@
     </w:p>
     <w:p>
       <w:pPr>
+        <w:spacing w:after="100" w:line="252" w:lineRule="auto"/>
+        <w:ind w:left="403" w:hanging="403"/>
+      </w:pPr>
+      <w:r>
+        <w:rPr>
+          <w:rFonts w:ascii="Arial" w:hAnsi="Arial"/>
+          <w:b/>
+          <w:i w:val="0"/>
+          <w:color w:val="B3422E"/>
+          <w:sz w:val="20"/>
+        </w:rPr>
+        <w:t xml:space="preserve">6. </w:t>
+      </w:r>
+      <w:r>
+        <w:rPr>
+          <w:rFonts w:ascii="Arial" w:hAnsi="Arial"/>
+          <w:b w:val="0"/>
+          <w:i/>
+          <w:color w:val="57525C"/>
+          <w:sz w:val="20"/>
+        </w:rPr>
+        <w:t>“Compare Co–Star, The Pattern, CHANI, and Human Design across onboarding, daily retention, monetization, voice, and user trust, then translate the findings into decisions for MING.”</w:t>
+      </w:r>
+    </w:p>
+    <w:p>
+      <w:pPr>
         <w:pStyle w:val="Heading2"/>
       </w:pPr>
       <w:r>
@@ -629,7 +684,7 @@
           <w:color w:val="17161A"/>
           <w:sz w:val="20"/>
         </w:rPr>
-        <w:t>The experience was closer to directing a small product team than using a traditional website builder. Natural-language prompts were effective for setting the product direction and visual taste, while shorter corrective prompts were better for details such as image blending, typography, mobile layout, and copy repetition. The fastest progress happened when I gave the AI a clear product behavior and a specific design critique at the same time.</w:t>
+        <w:t>The experience was closer to directing a small product team than using a traditional website builder. Natural-language prompts were effective for setting product direction, research questions, and visual taste, while shorter corrective prompts were better for image blending, typography, mobile layout, and repeated copy. I reviewed generated logos and calligraphic assets before they entered the site. The fastest progress happened when I gave the AI a clear product behavior, audience constraint, and specific design critique at the same time.</w:t>
       </w:r>
     </w:p>
     <w:p>
@@ -706,6 +761,23 @@
           <w:sz w:val="20"/>
         </w:rPr>
         <w:t>Deployment exposed dependency and build-policy issues that were not visible in the design phase.</w:t>
+      </w:r>
+    </w:p>
+    <w:p>
+      <w:pPr>
+        <w:pStyle w:val="ListBullet"/>
+        <w:spacing w:after="60" w:line="252" w:lineRule="auto"/>
+        <w:ind w:left="720" w:hanging="360"/>
+      </w:pPr>
+      <w:r>
+        <w:rPr>
+          <w:rFonts w:ascii="Arial" w:hAnsi="Arial"/>
+          <w:b w:val="0"/>
+          <w:i w:val="0"/>
+          <w:color w:val="17161A"/>
+          <w:sz w:val="20"/>
+        </w:rPr>
+        <w:t>BaZi conventions can differ, especially around late-Zi-hour handling, so the calculation needed documented assumptions and independent comparison rather than visual plausibility alone.</w:t>
       </w:r>
     </w:p>
     <w:p>
@@ -808,6 +880,23 @@
     </w:p>
     <w:p>
       <w:pPr>
+        <w:pStyle w:val="ListBullet"/>
+        <w:spacing w:after="60" w:line="252" w:lineRule="auto"/>
+        <w:ind w:left="720" w:hanging="360"/>
+      </w:pPr>
+      <w:r>
+        <w:rPr>
+          <w:rFonts w:ascii="Arial" w:hAnsi="Arial"/>
+          <w:b w:val="0"/>
+          <w:i w:val="0"/>
+          <w:color w:val="17161A"/>
+          <w:sz w:val="20"/>
+        </w:rPr>
+        <w:t>Competitive research is most useful when it changes the build. MING adopted immediate value, a named daily ritual, and transparent reasoning while avoiding an account gate, deterministic claims, and unexplained output.</w:t>
+      </w:r>
+    </w:p>
+    <w:p>
+      <w:pPr>
         <w:pStyle w:val="Heading2"/>
       </w:pPr>
       <w:r>
@@ -845,7 +934,7 @@
           <w:color w:val="17161A"/>
           <w:sz w:val="20"/>
         </w:rPr>
-        <w:t>Verified solar terms, published sexagenary anchors, and 4,000 independently generated Four Pillars charts.</w:t>
+        <w:t>Verified solar terms and published sexagenary anchors, then compared 4,000 randomly generated charts with an independent implementation with zero pillar mismatches under the shared convention.</w:t>
       </w:r>
     </w:p>
     <w:p>
@@ -880,6 +969,65 @@
           <w:sz w:val="20"/>
         </w:rPr>
         <w:t>Completed a production build and opened the deployed URL in a separate browser session.</w:t>
+      </w:r>
+    </w:p>
+    <w:p>
+      <w:pPr>
+        <w:pStyle w:val="Heading2"/>
+      </w:pPr>
+      <w:r>
+        <w:t>Supporting Work Completed</w:t>
+      </w:r>
+    </w:p>
+    <w:p>
+      <w:pPr>
+        <w:pStyle w:val="ListBullet"/>
+        <w:spacing w:after="60" w:line="252" w:lineRule="auto"/>
+        <w:ind w:left="720" w:hanging="360"/>
+      </w:pPr>
+      <w:r>
+        <w:rPr>
+          <w:rFonts w:ascii="Arial" w:hAnsi="Arial"/>
+          <w:b w:val="0"/>
+          <w:i w:val="0"/>
+          <w:color w:val="17161A"/>
+          <w:sz w:val="20"/>
+        </w:rPr>
+        <w:t>Competitive and audience research: documented onboarding, retention, pricing, voice, and trust patterns across Co–Star, The Pattern, CHANI, Human Design, and English-language BaZi communities.</w:t>
+      </w:r>
+    </w:p>
+    <w:p>
+      <w:pPr>
+        <w:pStyle w:val="ListBullet"/>
+        <w:spacing w:after="60" w:line="252" w:lineRule="auto"/>
+        <w:ind w:left="720" w:hanging="360"/>
+      </w:pPr>
+      <w:r>
+        <w:rPr>
+          <w:rFonts w:ascii="Arial" w:hAnsi="Arial"/>
+          <w:b w:val="0"/>
+          <w:i w:val="0"/>
+          <w:color w:val="17161A"/>
+          <w:sz w:val="20"/>
+        </w:rPr>
+        <w:t>Brand system: developed the MING name and positioning, logo, color direction, original calligraphic/celestial artwork, and separate visual symbols for the four feature themes.</w:t>
+      </w:r>
+    </w:p>
+    <w:p>
+      <w:pPr>
+        <w:pStyle w:val="ListBullet"/>
+        <w:spacing w:after="60" w:line="252" w:lineRule="auto"/>
+        <w:ind w:left="720" w:hanging="360"/>
+      </w:pPr>
+      <w:r>
+        <w:rPr>
+          <w:rFonts w:ascii="Arial" w:hAnsi="Arial"/>
+          <w:b w:val="0"/>
+          <w:i w:val="0"/>
+          <w:color w:val="17161A"/>
+          <w:sz w:val="20"/>
+        </w:rPr>
+        <w:t>Public project record: maintained three GitHub repositories—ming for the early landing/waitlist direction, ming-daily-ritual for the final working demo, and ming-workspace for research, briefs, reviews, brand files, and supporting evidence.</w:t>
       </w:r>
     </w:p>
     <w:p>
@@ -1247,6 +1395,23 @@
     </w:p>
     <w:p>
       <w:pPr>
+        <w:pStyle w:val="ListBullet"/>
+        <w:spacing w:after="60" w:line="252" w:lineRule="auto"/>
+        <w:ind w:left="720" w:hanging="360"/>
+      </w:pPr>
+      <w:r>
+        <w:rPr>
+          <w:rFonts w:ascii="Arial" w:hAnsi="Arial"/>
+          <w:b w:val="0"/>
+          <w:i w:val="0"/>
+          <w:color w:val="17161A"/>
+          <w:sz w:val="20"/>
+        </w:rPr>
+        <w:t>Decide how much of the reading is editorially authored versus templated, and establish a content-review process that preserves a human, culturally responsible voice at scale.</w:t>
+      </w:r>
+    </w:p>
+    <w:p>
+      <w:pPr>
         <w:pStyle w:val="Heading2"/>
       </w:pPr>
       <w:r>

</xml_diff>

<commit_message>
Replace expired preview with production URL
</commit_message>
<xml_diff>
--- a/docs/MING_Vibe_Coding_Project_Memo.docx
+++ b/docs/MING_Vibe_Coding_Project_Memo.docx
@@ -129,7 +129,7 @@
           <w:color w:val="17161A"/>
           <w:sz w:val="20"/>
         </w:rPr>
-        <w:t>September 1, 2026</w:t>
+        <w:t>September 2, 2026</w:t>
       </w:r>
     </w:p>
     <w:p>
@@ -153,7 +153,7 @@
             <w:color w:val="302A66"/>
             <w:u w:val="single"/>
           </w:rPr>
-          <w:t>https://temporary-instant-chestnut-6aq70wf.vercel.app/</w:t>
+          <w:t>https://ming-daily-ritual-ashy.vercel.app/</w:t>
         </w:r>
       </w:hyperlink>
     </w:p>
@@ -1390,7 +1390,7 @@
           <w:color w:val="17161A"/>
           <w:sz w:val="20"/>
         </w:rPr>
-        <w:t>Replace the temporary preview with a permanent domain and production analytics before public launch.</w:t>
+        <w:t>Connect GitHub to Vercel for automatic deployments, then add a custom domain and production analytics before public launch.</w:t>
       </w:r>
     </w:p>
     <w:p>

</xml_diff>